<commit_message>
fix:revactoring common -> comments
</commit_message>
<xml_diff>
--- a/public/rights/en/T&Cs.docx
+++ b/public/rights/en/T&Cs.docx
@@ -99,7 +99,7 @@
         <mc:AlternateContent>
           <mc:Choice Requires="wps">
             <w:drawing>
-              <wp:anchor behindDoc="0" distT="0" distB="0" distL="114300" distR="114300" simplePos="0" locked="0" layoutInCell="1" allowOverlap="1" relativeHeight="2">
+              <wp:anchor behindDoc="0" distT="0" distB="0" distL="0" distR="0" simplePos="0" locked="0" layoutInCell="1" allowOverlap="1" relativeHeight="2">
                 <wp:simplePos x="0" y="0"/>
                 <wp:positionH relativeFrom="column">
                   <wp:align>center</wp:align>
@@ -107,7 +107,7 @@
                 <wp:positionV relativeFrom="paragraph">
                   <wp:posOffset>635</wp:posOffset>
                 </wp:positionV>
-                <wp:extent cx="5943600" cy="1270"/>
+                <wp:extent cx="5944235" cy="1905"/>
                 <wp:effectExtent l="0" t="0" r="0" b="0"/>
                 <wp:wrapNone/>
                 <wp:docPr id="1" name="shape_0"/>
@@ -115,14 +115,10 @@
                   <a:graphicData uri="http://schemas.microsoft.com/office/word/2010/wordprocessingShape">
                     <wps:wsp>
                       <wps:cNvSpPr/>
-                      <wps:nvSpPr>
-                        <wps:cNvPr id="0" name="Rectangle 1"/>
-                        <wps:cNvSpPr/>
-                      </wps:nvSpPr>
                       <wps:spPr>
                         <a:xfrm>
                           <a:off x="0" y="0"/>
-                          <a:ext cx="5942880" cy="720"/>
+                          <a:ext cx="5943600" cy="1440"/>
                         </a:xfrm>
                         <a:prstGeom prst="rect">
                           <a:avLst/>
@@ -134,6 +130,12 @@
                           <a:noFill/>
                         </a:ln>
                       </wps:spPr>
+                      <wps:style>
+                        <a:lnRef idx="0"/>
+                        <a:fillRef idx="0"/>
+                        <a:effectRef idx="0"/>
+                        <a:fontRef idx="minor"/>
+                      </wps:style>
                       <wps:bodyPr/>
                     </wps:wsp>
                   </a:graphicData>
@@ -143,7 +145,7 @@
           </mc:Choice>
           <mc:Fallback>
             <w:pict>
-              <v:rect id="shape_0" ID="shape_0" fillcolor="#a0a0a0" stroked="f" style="position:absolute;margin-left:0pt;margin-top:0pt;width:467.9pt;height:0pt;mso-position-horizontal:center;mso-position-vertical:top">
+              <v:rect id="shape_0" ID="shape_0" fillcolor="#a0a0a0" stroked="f" style="position:absolute;margin-left:0pt;margin-top:0.05pt;width:467.95pt;height:0.05pt;mso-position-horizontal:center">
                 <w10:wrap type="none"/>
                 <v:fill o:detectmouseclick="t" type="solid" color2="#5f5f5f"/>
                 <v:stroke color="#3465a4" joinstyle="round" endcap="flat"/>
@@ -231,12 +233,21 @@
         </w:rPr>
         <w:t>](“we,” “us” or “our”), concerning your access to and use of the [</w:t>
       </w:r>
+      <w:hyperlink r:id="rId2">
+        <w:r>
+          <w:rPr>
+            <w:rStyle w:val="InternetLink"/>
+            <w:rFonts w:eastAsia="Arial" w:cs="Arial" w:ascii="Arial" w:hAnsi="Arial"/>
+          </w:rPr>
+          <w:t>wnet-sn.herokuapp.com</w:t>
+        </w:r>
+      </w:hyperlink>
       <w:r>
         <w:rPr>
           <w:rFonts w:eastAsia="Arial" w:cs="Arial" w:ascii="Arial" w:hAnsi="Arial"/>
           <w:color w:val="4472C4" w:themeColor="accent1"/>
         </w:rPr>
-        <w:t>wnet.herokuapp.com]</w:t>
+        <w:t>]</w:t>
       </w:r>
       <w:r>
         <w:rPr>
@@ -5913,7 +5924,7 @@
         </w:rPr>
         <w:t xml:space="preserve">The arbitration shall be commenced and conducted Kazakhstan Arbitration Court that available at the “KAC” website </w:t>
       </w:r>
-      <w:hyperlink r:id="rId2">
+      <w:hyperlink r:id="rId3">
         <w:r>
           <w:rPr>
             <w:rStyle w:val="InternetLink"/>
@@ -7333,24 +7344,12 @@
         <w:rPr>
           <w:rFonts w:eastAsia="Arial" w:cs="Arial" w:ascii="Arial" w:hAnsi="Arial"/>
         </w:rPr>
-        <w:t>[Email Address] wnet.</w:t>
-      </w:r>
-      <w:r>
-        <w:rPr>
-          <w:rFonts w:eastAsia="Arial" w:cs="Arial" w:ascii="Arial" w:hAnsi="Arial"/>
-        </w:rPr>
-        <w:t>soc.net</w:t>
-      </w:r>
-      <w:r>
-        <w:rPr>
-          <w:rFonts w:eastAsia="Arial" w:cs="Arial" w:ascii="Arial" w:hAnsi="Arial"/>
-        </w:rPr>
-        <w:t>@gmail.com</w:t>
+        <w:t>[Email Address] wnet.soc.net@gmail.com</w:t>
       </w:r>
     </w:p>
     <w:sectPr>
-      <w:headerReference w:type="default" r:id="rId3"/>
-      <w:footerReference w:type="default" r:id="rId4"/>
+      <w:headerReference w:type="default" r:id="rId4"/>
+      <w:footerReference w:type="default" r:id="rId5"/>
       <w:type w:val="nextPage"/>
       <w:pgSz w:w="12240" w:h="15840"/>
       <w:pgMar w:left="1440" w:right="1440" w:header="0" w:top="1361" w:footer="720" w:bottom="1361" w:gutter="0"/>
@@ -7859,7 +7858,6 @@
       <w:rPr>
         <w:rFonts w:ascii="Times New Roman" w:hAnsi="Times New Roman" w:eastAsia="Times New Roman" w:cs="Times New Roman"/>
         <w:color w:val="000000"/>
-        <w:sz w:val="24"/>
         <w:szCs w:val="24"/>
         <w:lang w:val="en-US" w:eastAsia="zh-TW" w:bidi="ar-SA"/>
       </w:rPr>

</xml_diff>